<commit_message>
Updating readme to include instructions for accessing/producing large files.
</commit_message>
<xml_diff>
--- a/byteMe/documents/FTES Data Preparation Report.docx
+++ b/byteMe/documents/FTES Data Preparation Report.docx
@@ -77,7 +77,7 @@
     <w:p>
       <w:r>
         <w:pict w14:anchorId="2B0A9B0E">
-          <v:rect id="_x0000_i1079" style="width:0;height:1.5pt" o:hralign="center" o:hrstd="t" o:hr="t" fillcolor="#a0a0a0" stroked="f"/>
+          <v:rect id="_x0000_i1025" style="width:0;height:1.5pt" o:hralign="center" o:hrstd="t" o:hr="t" fillcolor="#a0a0a0" stroked="f"/>
         </w:pict>
       </w:r>
     </w:p>
@@ -117,7 +117,7 @@
     <w:p>
       <w:r>
         <w:pict w14:anchorId="50EB3AE2">
-          <v:rect id="_x0000_i1080" style="width:0;height:1.5pt" o:hralign="center" o:hrstd="t" o:hr="t" fillcolor="#a0a0a0" stroked="f"/>
+          <v:rect id="_x0000_i1026" style="width:0;height:1.5pt" o:hralign="center" o:hrstd="t" o:hr="t" fillcolor="#a0a0a0" stroked="f"/>
         </w:pict>
       </w:r>
     </w:p>
@@ -203,7 +203,7 @@
     <w:p>
       <w:r>
         <w:pict w14:anchorId="6B3EBEEC">
-          <v:rect id="_x0000_i1081" style="width:0;height:1.5pt" o:hralign="center" o:hrstd="t" o:hr="t" fillcolor="#a0a0a0" stroked="f"/>
+          <v:rect id="_x0000_i1027" style="width:0;height:1.5pt" o:hralign="center" o:hrstd="t" o:hr="t" fillcolor="#a0a0a0" stroked="f"/>
         </w:pict>
       </w:r>
     </w:p>
@@ -245,15 +245,7 @@
       </w:r>
       <w:r>
         <w:lastRenderedPageBreak/>
-        <w:t xml:space="preserve">raw </w:t>
-      </w:r>
-      <w:proofErr w:type="gramStart"/>
-      <w:r>
-        <w:t>temperature</w:t>
-      </w:r>
-      <w:proofErr w:type="gramEnd"/>
-      <w:r>
-        <w:t xml:space="preserve"> would force the model to simultaneously learn well-to-well absolute offsets and the thermal dynamics, which </w:t>
+        <w:t xml:space="preserve">raw temperature would force the model to simultaneously learn well-to-well absolute offsets and the thermal dynamics, which </w:t>
       </w:r>
       <w:proofErr w:type="gramStart"/>
       <w:r>
@@ -397,7 +389,7 @@
     <w:p>
       <w:r>
         <w:pict w14:anchorId="612F673B">
-          <v:rect id="_x0000_i1082" style="width:0;height:1.5pt" o:hralign="center" o:hrstd="t" o:hr="t" fillcolor="#a0a0a0" stroked="f"/>
+          <v:rect id="_x0000_i1028" style="width:0;height:1.5pt" o:hralign="center" o:hrstd="t" o:hr="t" fillcolor="#a0a0a0" stroked="f"/>
         </w:pict>
       </w:r>
     </w:p>
@@ -1003,7 +995,7 @@
     <w:p>
       <w:r>
         <w:pict w14:anchorId="72983A3E">
-          <v:rect id="_x0000_i1083" style="width:0;height:1.5pt" o:hralign="center" o:hrstd="t" o:hr="t" fillcolor="#a0a0a0" stroked="f"/>
+          <v:rect id="_x0000_i1029" style="width:0;height:1.5pt" o:hralign="center" o:hrstd="t" o:hr="t" fillcolor="#a0a0a0" stroked="f"/>
         </w:pict>
       </w:r>
     </w:p>
@@ -1093,7 +1085,7 @@
     <w:p>
       <w:r>
         <w:pict w14:anchorId="54FF475F">
-          <v:rect id="_x0000_i1084" style="width:0;height:1.5pt" o:hralign="center" o:hrstd="t" o:hr="t" fillcolor="#a0a0a0" stroked="f"/>
+          <v:rect id="_x0000_i1030" style="width:0;height:1.5pt" o:hralign="center" o:hrstd="t" o:hr="t" fillcolor="#a0a0a0" stroked="f"/>
         </w:pict>
       </w:r>
     </w:p>
@@ -1171,7 +1163,7 @@
     <w:p>
       <w:r>
         <w:pict w14:anchorId="6061E240">
-          <v:rect id="_x0000_i1085" style="width:0;height:1.5pt" o:hralign="center" o:hrstd="t" o:hr="t" fillcolor="#a0a0a0" stroked="f"/>
+          <v:rect id="_x0000_i1031" style="width:0;height:1.5pt" o:hralign="center" o:hrstd="t" o:hr="t" fillcolor="#a0a0a0" stroked="f"/>
         </w:pict>
       </w:r>
     </w:p>
@@ -1635,17 +1627,11 @@
     <w:p>
       <w:r>
         <w:pict w14:anchorId="263189D1">
-          <v:rect id="_x0000_i1086" style="width:0;height:1.5pt" o:hralign="center" o:hrstd="t" o:hr="t" fillcolor="#a0a0a0" stroked="f"/>
+          <v:rect id="_x0000_i1032" style="width:0;height:1.5pt" o:hralign="center" o:hrstd="t" o:hr="t" fillcolor="#a0a0a0" stroked="f"/>
         </w:pict>
       </w:r>
     </w:p>
     <w:p>
-      <w:pPr>
-        <w:rPr>
-          <w:b/>
-          <w:bCs/>
-        </w:rPr>
-      </w:pPr>
       <w:r>
         <w:rPr>
           <w:b/>
@@ -1656,16 +1642,15 @@
     </w:p>
     <w:p>
       <w:r>
-        <w:t>All features are computed using only past or present information — no future values are used, which would constitute data leakage. Features are grouped by the experimental design's family structure:</w:t>
-      </w:r>
-    </w:p>
-    <w:p>
-      <w:pPr>
-        <w:rPr>
-          <w:b/>
-          <w:bCs/>
-        </w:rPr>
-      </w:pPr>
+        <w:t>All features are computed using only past or present information — no future values are used, which would constitute data leakage. Features are grouped into three families:</w:t>
+      </w:r>
+    </w:p>
+    <w:p>
+      <w:r>
+        <w:pict w14:anchorId="137216DC">
+          <v:rect id="_x0000_i1059" style="width:0;height:1.5pt" o:hralign="center" o:hrstd="t" o:hr="t" fillcolor="#a0a0a0" stroked="f"/>
+        </w:pict>
+      </w:r>
     </w:p>
     <w:p>
       <w:r>
@@ -1696,8 +1681,8 @@
       </w:tblPr>
       <w:tblGrid>
         <w:gridCol w:w="2244"/>
-        <w:gridCol w:w="2834"/>
-        <w:gridCol w:w="4282"/>
+        <w:gridCol w:w="2675"/>
+        <w:gridCol w:w="4441"/>
       </w:tblGrid>
       <w:tr>
         <w:trPr>
@@ -1870,7 +1855,7 @@
             </w:r>
             <w:proofErr w:type="spellEnd"/>
             <w:r>
-              <w:t>[t−1] per hour</w:t>
+              <w:t>[t−1] per hour</w:t>
             </w:r>
           </w:p>
         </w:tc>
@@ -1979,37 +1964,26 @@
           </w:tcPr>
           <w:p>
             <w:r>
-              <w:t>Smooths pump transients; the model needs to know the </w:t>
-            </w:r>
-            <w:r>
-              <w:rPr>
-                <w:i/>
-                <w:iCs/>
-              </w:rPr>
-              <w:t>sustained</w:t>
-            </w:r>
-            <w:r>
-              <w:t> injection rate, not instantaneous spikes</w:t>
+              <w:t>Smooths pump transients; the model needs to know the sustained injection rate, not instantaneous spikes</w:t>
             </w:r>
           </w:p>
         </w:tc>
       </w:tr>
     </w:tbl>
     <w:p>
-      <w:pPr>
+      <w:r>
+        <w:pict w14:anchorId="1AE3B40A">
+          <v:rect id="_x0000_i1060" style="width:0;height:1.5pt" o:hralign="center" o:hrstd="t" o:hr="t" fillcolor="#a0a0a0" stroked="f"/>
+        </w:pict>
+      </w:r>
+    </w:p>
+    <w:p>
+      <w:r>
         <w:rPr>
           <w:b/>
           <w:bCs/>
         </w:rPr>
-      </w:pPr>
-    </w:p>
-    <w:p>
-      <w:r>
-        <w:rPr>
-          <w:b/>
-          <w:bCs/>
-        </w:rPr>
-        <w:t>Family C — Autoregressive target history</w:t>
+        <w:t>Family B — Autoregressive target history</w:t>
       </w:r>
     </w:p>
     <w:tbl>
@@ -2032,8 +2006,8 @@
       </w:tblPr>
       <w:tblGrid>
         <w:gridCol w:w="2241"/>
-        <w:gridCol w:w="3265"/>
-        <w:gridCol w:w="3854"/>
+        <w:gridCol w:w="3055"/>
+        <w:gridCol w:w="4064"/>
       </w:tblGrid>
       <w:tr>
         <w:trPr>
@@ -2201,9 +2175,12 @@
             <w:hideMark/>
           </w:tcPr>
           <w:p>
+            <w:r>
+              <w:t>TL/</w:t>
+            </w:r>
             <w:proofErr w:type="spellStart"/>
             <w:r>
-              <w:t>TL_INT_mean</w:t>
+              <w:t>TN_INT_mean</w:t>
             </w:r>
             <w:proofErr w:type="spellEnd"/>
             <w:r>
@@ -2215,7 +2192,7 @@
             </w:r>
             <w:proofErr w:type="spellEnd"/>
             <w:r>
-              <w:t>[t−1] per hour</w:t>
+              <w:t>[t−1] per hour</w:t>
             </w:r>
           </w:p>
         </w:tc>
@@ -2246,20 +2223,19 @@
       </w:tr>
     </w:tbl>
     <w:p>
-      <w:pPr>
+      <w:r>
+        <w:pict w14:anchorId="2C7EAD5D">
+          <v:rect id="_x0000_i1061" style="width:0;height:1.5pt" o:hralign="center" o:hrstd="t" o:hr="t" fillcolor="#a0a0a0" stroked="f"/>
+        </w:pict>
+      </w:r>
+    </w:p>
+    <w:p>
+      <w:r>
         <w:rPr>
           <w:b/>
           <w:bCs/>
         </w:rPr>
-      </w:pPr>
-    </w:p>
-    <w:p>
-      <w:r>
-        <w:rPr>
-          <w:b/>
-          <w:bCs/>
-        </w:rPr>
-        <w:t>Family D — Engineered physics features</w:t>
+        <w:t>Family C — Engineered physics features (encode cumulative thermal state)</w:t>
       </w:r>
     </w:p>
     <w:tbl>
@@ -2281,9 +2257,9 @@
         <w:tblLook w:val="04A0" w:firstRow="1" w:lastRow="0" w:firstColumn="1" w:lastColumn="0" w:noHBand="0" w:noVBand="1"/>
       </w:tblPr>
       <w:tblGrid>
-        <w:gridCol w:w="4669"/>
-        <w:gridCol w:w="1947"/>
-        <w:gridCol w:w="2744"/>
+        <w:gridCol w:w="4778"/>
+        <w:gridCol w:w="2056"/>
+        <w:gridCol w:w="2526"/>
       </w:tblGrid>
       <w:tr>
         <w:trPr>
@@ -2519,28 +2495,17 @@
             <w:hideMark/>
           </w:tcPr>
           <w:p>
-            <w:hyperlink r:id="rId7" w:history="1">
-              <w:r>
-                <w:rPr>
-                  <w:rStyle w:val="Hyperlink"/>
-                </w:rPr>
-                <w:t>TL/</w:t>
-              </w:r>
-              <w:proofErr w:type="spellStart"/>
-              <w:r>
-                <w:rPr>
-                  <w:rStyle w:val="Hyperlink"/>
-                </w:rPr>
-                <w:t>TN_INT_mean</w:t>
-              </w:r>
-              <w:proofErr w:type="spellEnd"/>
-              <w:r>
-                <w:rPr>
-                  <w:rStyle w:val="Hyperlink"/>
-                </w:rPr>
-                <w:t xml:space="preserve"> − T0[well]</w:t>
-              </w:r>
-            </w:hyperlink>
+            <w:r>
+              <w:t>TL/</w:t>
+            </w:r>
+            <w:proofErr w:type="spellStart"/>
+            <w:r>
+              <w:t>TN_INT_mean</w:t>
+            </w:r>
+            <w:proofErr w:type="spellEnd"/>
+            <w:r>
+              <w:t xml:space="preserve"> − T0[well]</w:t>
+            </w:r>
           </w:p>
         </w:tc>
         <w:tc>
@@ -2563,14 +2528,7 @@
           </w:tcPr>
           <w:p>
             <w:r>
-              <w:rPr>
-                <w:b/>
-                <w:bCs/>
-              </w:rPr>
-              <w:t>The primary prediction target.</w:t>
-            </w:r>
-            <w:r>
-              <w:t> Predicting temperature rise above ambient removes well-to-well absolute offsets and focuses the model on the physical signal of interest</w:t>
+              <w:t>The primary prediction target. Predicting temperature rise above ambient removes well-to-well absolute offsets and focuses the model on the physical signal of interest</w:t>
             </w:r>
           </w:p>
         </w:tc>
@@ -2624,40 +2582,22 @@
             <w:hideMark/>
           </w:tcPr>
           <w:p>
-            <m:oMathPara>
-              <m:oMath>
-                <m:r>
-                  <w:rPr>
-                    <w:rFonts w:ascii="Cambria Math" w:hAnsi="Cambria Math"/>
-                  </w:rPr>
-                  <m:t>∑(</m:t>
-                </m:r>
-                <m:r>
-                  <m:rPr>
-                    <m:nor/>
-                  </m:rPr>
-                  <m:t>Net Flow</m:t>
-                </m:r>
-                <m:r>
-                  <w:rPr>
-                    <w:rFonts w:ascii="Cambria Math" w:hAnsi="Cambria Math"/>
-                  </w:rPr>
-                  <m:t>×</m:t>
-                </m:r>
-                <m:r>
-                  <m:rPr>
-                    <m:nor/>
-                  </m:rPr>
-                  <m:t>TC_INT_mean</m:t>
-                </m:r>
-                <m:r>
-                  <w:rPr>
-                    <w:rFonts w:ascii="Cambria Math" w:hAnsi="Cambria Math"/>
-                  </w:rPr>
-                  <m:t>)×Δt</m:t>
-                </m:r>
-              </m:oMath>
-            </m:oMathPara>
+            <w:r>
+              <w:t xml:space="preserve">Σ (Net Flow × </w:t>
+            </w:r>
+            <w:proofErr w:type="spellStart"/>
+            <w:r>
+              <w:t>TC_INT_mean</w:t>
+            </w:r>
+            <w:proofErr w:type="spellEnd"/>
+            <w:r>
+              <w:t xml:space="preserve">) × </w:t>
+            </w:r>
+            <w:proofErr w:type="spellStart"/>
+            <w:r>
+              <w:t>Δt</w:t>
+            </w:r>
+            <w:proofErr w:type="spellEnd"/>
           </w:p>
         </w:tc>
         <w:tc>
@@ -2680,21 +2620,11 @@
           </w:tcPr>
           <w:p>
             <w:r>
-              <w:t xml:space="preserve">Tracks total thermal energy delivered to the fracture system since injection start. More physically correct than flow-alone because hotter water carries more heat per liter — </w:t>
+              <w:t xml:space="preserve">Tracks total thermal energy delivered to the fracture system since injection start. More physically correct than flow </w:t>
             </w:r>
             <w:r>
               <w:lastRenderedPageBreak/>
-              <w:t>rated </w:t>
-            </w:r>
-            <w:r>
-              <w:rPr>
-                <w:i/>
-                <w:iCs/>
-              </w:rPr>
-              <w:t>Critical</w:t>
-            </w:r>
-            <w:r>
-              <w:t> importance in the experimental design</w:t>
+              <w:t>alone because hotter water carries more heat per liter — rated Critical importance in the experimental design</w:t>
             </w:r>
           </w:p>
         </w:tc>
@@ -2722,7 +2652,7 @@
             <w:hideMark/>
           </w:tcPr>
           <w:p>
-            <w:hyperlink r:id="rId8" w:history="1">
+            <w:hyperlink r:id="rId7" w:history="1">
               <w:proofErr w:type="spellStart"/>
               <w:r>
                 <w:rPr>
@@ -2760,7 +2690,7 @@
           </w:tcPr>
           <w:p>
             <w:r>
-              <w:t>TEC-INT-U − TEC-INT-L per well</w:t>
+              <w:t>TEC-INT-U − TEC-INT-L per well</w:t>
             </w:r>
           </w:p>
         </w:tc>
@@ -2791,12 +2721,11 @@
       </w:tr>
     </w:tbl>
     <w:p>
-      <w:pPr>
-        <w:rPr>
-          <w:b/>
-          <w:bCs/>
-        </w:rPr>
-      </w:pPr>
+      <w:r>
+        <w:pict w14:anchorId="12CD9870">
+          <v:rect id="_x0000_i1062" style="width:0;height:1.5pt" o:hralign="center" o:hrstd="t" o:hr="t" fillcolor="#a0a0a0" stroked="f"/>
+        </w:pict>
+      </w:r>
     </w:p>
     <w:p>
       <w:r>
@@ -2953,7 +2882,7 @@
           </w:tcPr>
           <w:p>
             <w:r>
-              <w:t>Derived from </w:t>
+              <w:t xml:space="preserve">Derived from </w:t>
             </w:r>
             <w:proofErr w:type="spellStart"/>
             <w:r>
@@ -3148,13 +3077,7 @@
         </w:tc>
       </w:tr>
     </w:tbl>
-    <w:p>
-      <w:r>
-        <w:pict w14:anchorId="5580E53A">
-          <v:rect id="_x0000_i1087" style="width:0;height:1.5pt" o:hralign="center" o:hrstd="t" o:hr="t" fillcolor="#a0a0a0" stroked="f"/>
-        </w:pict>
-      </w:r>
-    </w:p>
+    <w:p/>
     <w:p>
       <w:pPr>
         <w:rPr>
@@ -3175,6 +3098,7 @@
           <w:b/>
           <w:bCs/>
         </w:rPr>
+        <w:lastRenderedPageBreak/>
         <w:t>Output Files</w:t>
       </w:r>
     </w:p>
@@ -3236,7 +3160,6 @@
                 <w:b/>
                 <w:bCs/>
               </w:rPr>
-              <w:lastRenderedPageBreak/>
               <w:t>File</w:t>
             </w:r>
           </w:p>

</xml_diff>